<commit_message>
typo in process docx and indent problems in learn set aside mako
</commit_message>
<xml_diff>
--- a/docassemble/AKA2JBranding/data/templates/learn_more_about_the_process_content.docx
+++ b/docassemble/AKA2JBranding/data/templates/learn_more_about_the_process_content.docx
@@ -7,7 +7,19 @@
         <w:pStyle w:val="Heading3"/>
       </w:pPr>
       <w:r>
-        <w:t>Read{% if (user_need == ‘divorce and legal_separation_or_divorce == 'legal separation') or (user_need == ‘answer divorce’ and case_type == ‘legal separation’) %} (although these are about divorce, the process is the same){% endif %}</w:t>
+        <w:t xml:space="preserve">Read{% if (user_need == </w:t>
+      </w:r>
+      <w:r>
+        <w:t>'</w:t>
+      </w:r>
+      <w:r>
+        <w:t>divorce</w:t>
+      </w:r>
+      <w:r>
+        <w:t>'</w:t>
+      </w:r>
+      <w:r>
+        <w:t xml:space="preserve"> and legal_separation_or_divorce == 'legal separation') or (user_need == ‘answer divorce’ and case_type == ‘legal separation’) %} (although these are about divorce, the process is the same){% endif %}</w:t>
       </w:r>
     </w:p>
     <w:p>
@@ -24,14 +36,34 @@
           <w:b/>
         </w:rPr>
         <w:t xml:space="preserve">Flow Chart for Case Process, SHC-185 </w:t>
+      </w:r>
+      <w:r>
+        <w:rPr>
+          <w:b/>
+        </w:rPr>
         <w:br/>
         <w:t>as a  file</w:t>
+      </w:r>
+      <w:r>
+        <w:rPr>
+          <w:b/>
+        </w:rPr>
         <w:br/>
+      </w:r>
+      <w:r>
+        <w:rPr>
+          <w:b/>
+        </w:rPr>
         <w:br/>
         <w:t xml:space="preserve">as a </w:t>
+      </w:r>
+      <w:r>
+        <w:rPr>
+          <w:b/>
+        </w:rPr>
         <w:br/>
       </w:r>
-      <w:hyperlink r:id="rId5" w:history="1">
+      <w:hyperlink r:id="rId7" w:history="1">
         <w:r>
           <w:rPr>
             <w:rStyle w:val="Hyperlink"/>
@@ -39,29 +71,15 @@
           <w:t>Word</w:t>
         </w:r>
       </w:hyperlink>
-      <w:hyperlink r:id="rId6" w:history="1">
+      <w:hyperlink r:id="rId8" w:history="1">
         <w:r>
           <w:rPr>
             <w:rStyle w:val="Hyperlink"/>
           </w:rPr>
-          <w:t>courts.alaska.gov/</w:t>
-        </w:r>
-        <w:proofErr w:type="spellStart"/>
-        <w:r>
-          <w:rPr>
-            <w:rStyle w:val="Hyperlink"/>
-          </w:rPr>
-          <w:t>shc</w:t>
-        </w:r>
-        <w:proofErr w:type="spellEnd"/>
-        <w:r>
-          <w:rPr>
-            <w:rStyle w:val="Hyperlink"/>
-          </w:rPr>
-          <w:t>/family/docs/shc-185.doc</w:t>
+          <w:t>courts.alaska.gov/shc/family/docs/shc-185.doc</w:t>
         </w:r>
       </w:hyperlink>
-      <w:hyperlink r:id="rId7" w:history="1">
+      <w:hyperlink r:id="rId9" w:history="1">
         <w:r>
           <w:rPr>
             <w:rStyle w:val="Hyperlink"/>
@@ -69,26 +87,12 @@
           <w:t>PDF</w:t>
         </w:r>
       </w:hyperlink>
-      <w:hyperlink r:id="rId8" w:history="1">
+      <w:hyperlink r:id="rId10" w:history="1">
         <w:r>
           <w:rPr>
             <w:rStyle w:val="Hyperlink"/>
           </w:rPr>
-          <w:t>courts.alaska.gov/</w:t>
-        </w:r>
-        <w:proofErr w:type="spellStart"/>
-        <w:r>
-          <w:rPr>
-            <w:rStyle w:val="Hyperlink"/>
-          </w:rPr>
-          <w:t>shc</w:t>
-        </w:r>
-        <w:proofErr w:type="spellEnd"/>
-        <w:r>
-          <w:rPr>
-            <w:rStyle w:val="Hyperlink"/>
-          </w:rPr>
-          <w:t>/family/docs/shc-185n.pdf</w:t>
+          <w:t>courts.alaska.gov/shc/family/docs/shc-185n.pdf</w:t>
         </w:r>
       </w:hyperlink>
     </w:p>
@@ -106,9 +110,14 @@
           <w:b/>
         </w:rPr>
         <w:t xml:space="preserve">The Life of a Divorce or Custody Case, </w:t>
+      </w:r>
+      <w:r>
+        <w:rPr>
+          <w:b/>
+        </w:rPr>
         <w:br/>
       </w:r>
-      <w:hyperlink r:id="rId9" w:history="1">
+      <w:hyperlink r:id="rId11" w:history="1">
         <w:r>
           <w:rPr>
             <w:rStyle w:val="Hyperlink"/>
@@ -116,26 +125,12 @@
           <w:t>SHC-180</w:t>
         </w:r>
       </w:hyperlink>
-      <w:hyperlink r:id="rId10" w:history="1">
+      <w:hyperlink r:id="rId12" w:history="1">
         <w:r>
           <w:rPr>
             <w:rStyle w:val="Hyperlink"/>
           </w:rPr>
-          <w:t>courts.alaska.gov/</w:t>
-        </w:r>
-        <w:proofErr w:type="spellStart"/>
-        <w:r>
-          <w:rPr>
-            <w:rStyle w:val="Hyperlink"/>
-          </w:rPr>
-          <w:t>shc</w:t>
-        </w:r>
-        <w:proofErr w:type="spellEnd"/>
-        <w:r>
-          <w:rPr>
-            <w:rStyle w:val="Hyperlink"/>
-          </w:rPr>
-          <w:t>/family/docs/shc-180n.pdf</w:t>
+          <w:t>courts.alaska.gov/shc/family/docs/shc-180n.pdf</w:t>
         </w:r>
       </w:hyperlink>
     </w:p>
@@ -156,7 +151,7 @@
         </w:numPr>
         <w:ind w:left="418"/>
       </w:pPr>
-      <w:hyperlink r:id="rId11" w:history="1">
+      <w:hyperlink r:id="rId13" w:history="1">
         <w:r>
           <w:rPr>
             <w:rStyle w:val="Hyperlink"/>
@@ -167,26 +162,12 @@
       <w:r>
         <w:br/>
       </w:r>
-      <w:hyperlink r:id="rId12" w:history="1">
+      <w:hyperlink r:id="rId14" w:history="1">
         <w:r>
           <w:rPr>
             <w:rStyle w:val="Hyperlink"/>
           </w:rPr>
-          <w:t>youtube.com/</w:t>
-        </w:r>
-        <w:proofErr w:type="spellStart"/>
-        <w:r>
-          <w:rPr>
-            <w:rStyle w:val="Hyperlink"/>
-          </w:rPr>
-          <w:t>watch?v</w:t>
-        </w:r>
-        <w:proofErr w:type="spellEnd"/>
-        <w:r>
-          <w:rPr>
-            <w:rStyle w:val="Hyperlink"/>
-          </w:rPr>
-          <w:t>=z2d2CLllPUU</w:t>
+          <w:t>youtube.com/watch?v=z2d2CLllPUU</w:t>
         </w:r>
       </w:hyperlink>
     </w:p>
@@ -199,7 +180,7 @@
         </w:numPr>
         <w:ind w:left="418"/>
       </w:pPr>
-      <w:hyperlink r:id="rId13" w:history="1">
+      <w:hyperlink r:id="rId15" w:history="1">
         <w:r>
           <w:rPr>
             <w:rStyle w:val="Hyperlink"/>
@@ -213,7 +194,7 @@
         </w:rPr>
         <w:br/>
       </w:r>
-      <w:hyperlink r:id="rId14" w:history="1">
+      <w:hyperlink r:id="rId16" w:history="1">
         <w:r>
           <w:rPr>
             <w:rStyle w:val="Hyperlink"/>
@@ -225,21 +206,7 @@
           <w:rPr>
             <w:rStyle w:val="Hyperlink"/>
           </w:rPr>
-          <w:t>tube.com/</w:t>
-        </w:r>
-        <w:proofErr w:type="spellStart"/>
-        <w:r>
-          <w:rPr>
-            <w:rStyle w:val="Hyperlink"/>
-          </w:rPr>
-          <w:t>watch?v</w:t>
-        </w:r>
-        <w:proofErr w:type="spellEnd"/>
-        <w:r>
-          <w:rPr>
-            <w:rStyle w:val="Hyperlink"/>
-          </w:rPr>
-          <w:t>=EzSV4Caz6Co</w:t>
+          <w:t>tube.com/watch?v=EzSV4Caz6Co</w:t>
         </w:r>
       </w:hyperlink>
     </w:p>
@@ -264,7 +231,7 @@
           <w:numId w:val="7"/>
         </w:numPr>
       </w:pPr>
-      <w:hyperlink r:id="rId15" w:history="1">
+      <w:hyperlink r:id="rId17" w:history="1">
         <w:r>
           <w:rPr>
             <w:rStyle w:val="Hyperlink"/>
@@ -275,26 +242,12 @@
       <w:r>
         <w:br/>
       </w:r>
-      <w:hyperlink r:id="rId16" w:history="1">
+      <w:hyperlink r:id="rId18" w:history="1">
         <w:r>
           <w:rPr>
             <w:rStyle w:val="Hyperlink"/>
           </w:rPr>
-          <w:t>youtube.com/</w:t>
-        </w:r>
-        <w:proofErr w:type="spellStart"/>
-        <w:r>
-          <w:rPr>
-            <w:rStyle w:val="Hyperlink"/>
-          </w:rPr>
-          <w:t>playlist?list</w:t>
-        </w:r>
-        <w:proofErr w:type="spellEnd"/>
-        <w:r>
-          <w:rPr>
-            <w:rStyle w:val="Hyperlink"/>
-          </w:rPr>
-          <w:t>=PLRS0LlEIQsuTsfO0wSTsSTIvVE5RO8sLc</w:t>
+          <w:t>youtube.com/playlist?list=PLRS0LlEIQsuTsfO0wSTsSTIvVE5RO8sLc</w:t>
         </w:r>
       </w:hyperlink>
     </w:p>
@@ -306,7 +259,7 @@
           <w:numId w:val="7"/>
         </w:numPr>
       </w:pPr>
-      <w:hyperlink r:id="rId17" w:history="1">
+      <w:hyperlink r:id="rId19" w:history="1">
         <w:r>
           <w:rPr>
             <w:rStyle w:val="Hyperlink"/>
@@ -317,26 +270,12 @@
       <w:r>
         <w:br/>
       </w:r>
-      <w:hyperlink r:id="rId18" w:history="1">
+      <w:hyperlink r:id="rId20" w:history="1">
         <w:r>
           <w:rPr>
             <w:rStyle w:val="Hyperlink"/>
           </w:rPr>
-          <w:t>youtube.com/</w:t>
-        </w:r>
-        <w:proofErr w:type="spellStart"/>
-        <w:r>
-          <w:rPr>
-            <w:rStyle w:val="Hyperlink"/>
-          </w:rPr>
-          <w:t>playlist?list</w:t>
-        </w:r>
-        <w:proofErr w:type="spellEnd"/>
-        <w:r>
-          <w:rPr>
-            <w:rStyle w:val="Hyperlink"/>
-          </w:rPr>
-          <w:t>=PLRS0LlEIQsuS1_8O5-1C2t8R2wp4nMsAb</w:t>
+          <w:t>youtube.com/playlist?list=PLRS0LlEIQsuS1_8O5-1C2t8R2wp4nMsAb</w:t>
         </w:r>
       </w:hyperlink>
     </w:p>
@@ -348,7 +287,7 @@
           <w:numId w:val="7"/>
         </w:numPr>
       </w:pPr>
-      <w:hyperlink r:id="rId19" w:history="1">
+      <w:hyperlink r:id="rId21" w:history="1">
         <w:r>
           <w:rPr>
             <w:rStyle w:val="Hyperlink"/>
@@ -359,26 +298,12 @@
       <w:r>
         <w:br/>
       </w:r>
-      <w:hyperlink r:id="rId20" w:history="1">
+      <w:hyperlink r:id="rId22" w:history="1">
         <w:r>
           <w:rPr>
             <w:rStyle w:val="Hyperlink"/>
           </w:rPr>
-          <w:t>youtube.com/</w:t>
-        </w:r>
-        <w:proofErr w:type="spellStart"/>
-        <w:r>
-          <w:rPr>
-            <w:rStyle w:val="Hyperlink"/>
-          </w:rPr>
-          <w:t>playlist?list</w:t>
-        </w:r>
-        <w:proofErr w:type="spellEnd"/>
-        <w:r>
-          <w:rPr>
-            <w:rStyle w:val="Hyperlink"/>
-          </w:rPr>
-          <w:t>=PLRS0LlEIQsuSZ_5ldwbTMMBlPeobdBe4R</w:t>
+          <w:t>youtube.com/playlist?list=PLRS0LlEIQsuSZ_5ldwbTMMBlPeobdBe4R</w:t>
         </w:r>
       </w:hyperlink>
     </w:p>
@@ -393,9 +318,11 @@
       </w:pPr>
       <w:r>
         <w:t xml:space="preserve">Find </w:t>
+      </w:r>
+      <w:r>
         <w:br/>
       </w:r>
-      <w:hyperlink r:id="rId21" w:history="1">
+      <w:hyperlink r:id="rId23" w:history="1">
         <w:r>
           <w:rPr>
             <w:rStyle w:val="Hyperlink"/>
@@ -403,36 +330,22 @@
           <w:t>Alaska Family Law Hearing &amp; Trial Preparation Videos</w:t>
         </w:r>
       </w:hyperlink>
-      <w:hyperlink r:id="rId22" w:history="1">
+      <w:hyperlink r:id="rId24" w:history="1">
         <w:r>
           <w:rPr>
             <w:rStyle w:val="Hyperlink"/>
           </w:rPr>
-          <w:t>youtube.com/</w:t>
-        </w:r>
-        <w:proofErr w:type="spellStart"/>
-        <w:r>
-          <w:rPr>
-            <w:rStyle w:val="Hyperlink"/>
-          </w:rPr>
-          <w:t>playlist?list</w:t>
-        </w:r>
-        <w:proofErr w:type="spellEnd"/>
-        <w:r>
-          <w:rPr>
-            <w:rStyle w:val="Hyperlink"/>
-          </w:rPr>
-          <w:t>=PL82589B66ED712B4B</w:t>
+          <w:t>youtube.com/playlist?list=PL82589B66ED712B4B</w:t>
         </w:r>
       </w:hyperlink>
     </w:p>
     <w:sectPr>
-      <w:headerReference w:type="default" r:id="rId25"/>
-      <w:headerReference w:type="first" r:id="rId26"/>
-      <w:headerReference w:type="even" r:id="rId27"/>
+      <w:headerReference w:type="even" r:id="rId25"/>
+      <w:headerReference w:type="default" r:id="rId26"/>
+      <w:footerReference w:type="even" r:id="rId27"/>
       <w:footerReference w:type="default" r:id="rId28"/>
-      <w:footerReference w:type="first" r:id="rId29"/>
-      <w:footerReference w:type="even" r:id="rId30"/>
+      <w:headerReference w:type="first" r:id="rId29"/>
+      <w:footerReference w:type="first" r:id="rId30"/>
       <w:pgSz w:w="12240" w:h="15840"/>
       <w:pgMar w:top="1440" w:right="1440" w:bottom="1440" w:left="1440" w:header="720" w:footer="720" w:gutter="0"/>
       <w:cols w:space="720"/>
@@ -442,8 +355,33 @@
 </w:document>
 </file>
 
+<file path=word/endnotes.xml><?xml version="1.0" encoding="utf-8"?>
+<w:endnotes xmlns:wpc="http://schemas.microsoft.com/office/word/2010/wordprocessingCanvas" xmlns:cx="http://schemas.microsoft.com/office/drawing/2014/chartex" xmlns:cx1="http://schemas.microsoft.com/office/drawing/2015/9/8/chartex" xmlns:cx2="http://schemas.microsoft.com/office/drawing/2015/10/21/chartex" xmlns:cx3="http://schemas.microsoft.com/office/drawing/2016/5/9/chartex" xmlns:cx4="http://schemas.microsoft.com/office/drawing/2016/5/10/chartex" xmlns:cx5="http://schemas.microsoft.com/office/drawing/2016/5/11/chartex" xmlns:cx6="http://schemas.microsoft.com/office/drawing/2016/5/12/chartex" xmlns:cx7="http://schemas.microsoft.com/office/drawing/2016/5/13/chartex" xmlns:cx8="http://schemas.microsoft.com/office/drawing/2016/5/14/chartex" xmlns:mc="http://schemas.openxmlformats.org/markup-compatibility/2006" xmlns:aink="http://schemas.microsoft.com/office/drawing/2016/ink" xmlns:am3d="http://schemas.microsoft.com/office/drawing/2017/model3d" xmlns:o="urn:schemas-microsoft-com:office:office" xmlns:r="http://schemas.openxmlformats.org/officeDocument/2006/relationships" xmlns:m="http://schemas.openxmlformats.org/officeDocument/2006/math" xmlns:v="urn:schemas-microsoft-com:vml" xmlns:wp14="http://schemas.microsoft.com/office/word/2010/wordprocessingDrawing" xmlns:wp="http://schemas.openxmlformats.org/drawingml/2006/wordprocessingDrawing" xmlns:w10="urn:schemas-microsoft-com:office:word" xmlns:w="http://schemas.openxmlformats.org/wordprocessingml/2006/main" xmlns:w14="http://schemas.microsoft.com/office/word/2010/wordml" xmlns:w15="http://schemas.microsoft.com/office/word/2012/wordml" xmlns:w16cex="http://schemas.microsoft.com/office/word/2018/wordml/cex" xmlns:w16cid="http://schemas.microsoft.com/office/word/2016/wordml/cid" xmlns:w16="http://schemas.microsoft.com/office/word/2018/wordml" xmlns:w16sdtdh="http://schemas.microsoft.com/office/word/2020/wordml/sdtdatahash" xmlns:w16se="http://schemas.microsoft.com/office/word/2015/wordml/symex" xmlns:wpg="http://schemas.microsoft.com/office/word/2010/wordprocessingGroup" xmlns:wpi="http://schemas.microsoft.com/office/word/2010/wordprocessingInk" xmlns:wne="http://schemas.microsoft.com/office/word/2006/wordml" xmlns:wps="http://schemas.microsoft.com/office/word/2010/wordprocessingShape" mc:Ignorable="w14 w15 w16se w16cid w16 w16cex w16sdtdh wp14">
+  <w:endnote w:type="separator" w:id="-1">
+    <w:p>
+      <w:pPr>
+        <w:spacing w:before="0" w:after="0"/>
+      </w:pPr>
+      <w:r>
+        <w:separator/>
+      </w:r>
+    </w:p>
+  </w:endnote>
+  <w:endnote w:type="continuationSeparator" w:id="0">
+    <w:p>
+      <w:pPr>
+        <w:spacing w:before="0" w:after="0"/>
+      </w:pPr>
+      <w:r>
+        <w:continuationSeparator/>
+      </w:r>
+    </w:p>
+  </w:endnote>
+</w:endnotes>
+</file>
+
 <file path=word/footer1.xml><?xml version="1.0" encoding="utf-8"?>
-<w:ftr xmlns:m="http://schemas.openxmlformats.org/officeDocument/2006/math" xmlns:mc="http://schemas.openxmlformats.org/markup-compatibility/2006" xmlns:mo="http://schemas.microsoft.com/office/mac/office/2008/main" xmlns:mv="urn:schemas-microsoft-com:mac:vml" xmlns:o="urn:schemas-microsoft-com:office:office" xmlns:r="http://schemas.openxmlformats.org/officeDocument/2006/relationships" xmlns:v="urn:schemas-microsoft-com:vml" xmlns:w10="urn:schemas-microsoft-com:office:word" xmlns:w14="http://schemas.microsoft.com/office/word/2010/wordml" xmlns:w="http://schemas.openxmlformats.org/wordprocessingml/2006/main" xmlns:wne="http://schemas.microsoft.com/office/word/2006/wordml" xmlns:wp14="http://schemas.microsoft.com/office/word/2010/wordprocessingDrawing" xmlns:wp="http://schemas.openxmlformats.org/drawingml/2006/wordprocessingDrawing" xmlns:wpc="http://schemas.microsoft.com/office/word/2010/wordprocessingCanvas" xmlns:wpg="http://schemas.microsoft.com/office/word/2010/wordprocessingGroup" xmlns:wpi="http://schemas.microsoft.com/office/word/2010/wordprocessingInk" xmlns:wps="http://schemas.microsoft.com/office/word/2010/wordprocessingShape" mc:Ignorable="w14 wp14">
+<w:ftr xmlns:wpc="http://schemas.microsoft.com/office/word/2010/wordprocessingCanvas" xmlns:cx="http://schemas.microsoft.com/office/drawing/2014/chartex" xmlns:cx1="http://schemas.microsoft.com/office/drawing/2015/9/8/chartex" xmlns:cx2="http://schemas.microsoft.com/office/drawing/2015/10/21/chartex" xmlns:cx3="http://schemas.microsoft.com/office/drawing/2016/5/9/chartex" xmlns:cx4="http://schemas.microsoft.com/office/drawing/2016/5/10/chartex" xmlns:cx5="http://schemas.microsoft.com/office/drawing/2016/5/11/chartex" xmlns:cx6="http://schemas.microsoft.com/office/drawing/2016/5/12/chartex" xmlns:cx7="http://schemas.microsoft.com/office/drawing/2016/5/13/chartex" xmlns:cx8="http://schemas.microsoft.com/office/drawing/2016/5/14/chartex" xmlns:mc="http://schemas.openxmlformats.org/markup-compatibility/2006" xmlns:aink="http://schemas.microsoft.com/office/drawing/2016/ink" xmlns:am3d="http://schemas.microsoft.com/office/drawing/2017/model3d" xmlns:o="urn:schemas-microsoft-com:office:office" xmlns:r="http://schemas.openxmlformats.org/officeDocument/2006/relationships" xmlns:m="http://schemas.openxmlformats.org/officeDocument/2006/math" xmlns:v="urn:schemas-microsoft-com:vml" xmlns:wp14="http://schemas.microsoft.com/office/word/2010/wordprocessingDrawing" xmlns:wp="http://schemas.openxmlformats.org/drawingml/2006/wordprocessingDrawing" xmlns:w10="urn:schemas-microsoft-com:office:word" xmlns:w="http://schemas.openxmlformats.org/wordprocessingml/2006/main" xmlns:w14="http://schemas.microsoft.com/office/word/2010/wordml" xmlns:w15="http://schemas.microsoft.com/office/word/2012/wordml" xmlns:w16cex="http://schemas.microsoft.com/office/word/2018/wordml/cex" xmlns:w16cid="http://schemas.microsoft.com/office/word/2016/wordml/cid" xmlns:w16="http://schemas.microsoft.com/office/word/2018/wordml" xmlns:w16sdtdh="http://schemas.microsoft.com/office/word/2020/wordml/sdtdatahash" xmlns:w16se="http://schemas.microsoft.com/office/word/2015/wordml/symex" xmlns:wpg="http://schemas.microsoft.com/office/word/2010/wordprocessingGroup" xmlns:wpi="http://schemas.microsoft.com/office/word/2010/wordprocessingInk" xmlns:wne="http://schemas.microsoft.com/office/word/2006/wordml" xmlns:wps="http://schemas.microsoft.com/office/word/2010/wordprocessingShape" mc:Ignorable="w14 w15 w16se w16cid w16 w16cex w16sdtdh wp14">
   <w:p>
     <w:pPr>
       <w:pStyle w:val="Footer"/>
@@ -453,7 +391,7 @@
 </file>
 
 <file path=word/footer2.xml><?xml version="1.0" encoding="utf-8"?>
-<w:ftr xmlns:m="http://schemas.openxmlformats.org/officeDocument/2006/math" xmlns:mc="http://schemas.openxmlformats.org/markup-compatibility/2006" xmlns:mo="http://schemas.microsoft.com/office/mac/office/2008/main" xmlns:mv="urn:schemas-microsoft-com:mac:vml" xmlns:o="urn:schemas-microsoft-com:office:office" xmlns:r="http://schemas.openxmlformats.org/officeDocument/2006/relationships" xmlns:v="urn:schemas-microsoft-com:vml" xmlns:w10="urn:schemas-microsoft-com:office:word" xmlns:w14="http://schemas.microsoft.com/office/word/2010/wordml" xmlns:w="http://schemas.openxmlformats.org/wordprocessingml/2006/main" xmlns:wne="http://schemas.microsoft.com/office/word/2006/wordml" xmlns:wp14="http://schemas.microsoft.com/office/word/2010/wordprocessingDrawing" xmlns:wp="http://schemas.openxmlformats.org/drawingml/2006/wordprocessingDrawing" xmlns:wpc="http://schemas.microsoft.com/office/word/2010/wordprocessingCanvas" xmlns:wpg="http://schemas.microsoft.com/office/word/2010/wordprocessingGroup" xmlns:wpi="http://schemas.microsoft.com/office/word/2010/wordprocessingInk" xmlns:wps="http://schemas.microsoft.com/office/word/2010/wordprocessingShape" mc:Ignorable="w14 wp14">
+<w:ftr xmlns:wpc="http://schemas.microsoft.com/office/word/2010/wordprocessingCanvas" xmlns:cx="http://schemas.microsoft.com/office/drawing/2014/chartex" xmlns:cx1="http://schemas.microsoft.com/office/drawing/2015/9/8/chartex" xmlns:cx2="http://schemas.microsoft.com/office/drawing/2015/10/21/chartex" xmlns:cx3="http://schemas.microsoft.com/office/drawing/2016/5/9/chartex" xmlns:cx4="http://schemas.microsoft.com/office/drawing/2016/5/10/chartex" xmlns:cx5="http://schemas.microsoft.com/office/drawing/2016/5/11/chartex" xmlns:cx6="http://schemas.microsoft.com/office/drawing/2016/5/12/chartex" xmlns:cx7="http://schemas.microsoft.com/office/drawing/2016/5/13/chartex" xmlns:cx8="http://schemas.microsoft.com/office/drawing/2016/5/14/chartex" xmlns:mc="http://schemas.openxmlformats.org/markup-compatibility/2006" xmlns:aink="http://schemas.microsoft.com/office/drawing/2016/ink" xmlns:am3d="http://schemas.microsoft.com/office/drawing/2017/model3d" xmlns:o="urn:schemas-microsoft-com:office:office" xmlns:r="http://schemas.openxmlformats.org/officeDocument/2006/relationships" xmlns:m="http://schemas.openxmlformats.org/officeDocument/2006/math" xmlns:v="urn:schemas-microsoft-com:vml" xmlns:wp14="http://schemas.microsoft.com/office/word/2010/wordprocessingDrawing" xmlns:wp="http://schemas.openxmlformats.org/drawingml/2006/wordprocessingDrawing" xmlns:w10="urn:schemas-microsoft-com:office:word" xmlns:w="http://schemas.openxmlformats.org/wordprocessingml/2006/main" xmlns:w14="http://schemas.microsoft.com/office/word/2010/wordml" xmlns:w15="http://schemas.microsoft.com/office/word/2012/wordml" xmlns:w16cex="http://schemas.microsoft.com/office/word/2018/wordml/cex" xmlns:w16cid="http://schemas.microsoft.com/office/word/2016/wordml/cid" xmlns:w16="http://schemas.microsoft.com/office/word/2018/wordml" xmlns:w16sdtdh="http://schemas.microsoft.com/office/word/2020/wordml/sdtdatahash" xmlns:w16se="http://schemas.microsoft.com/office/word/2015/wordml/symex" xmlns:wpg="http://schemas.microsoft.com/office/word/2010/wordprocessingGroup" xmlns:wpi="http://schemas.microsoft.com/office/word/2010/wordprocessingInk" xmlns:wne="http://schemas.microsoft.com/office/word/2006/wordml" xmlns:wps="http://schemas.microsoft.com/office/word/2010/wordprocessingShape" mc:Ignorable="w14 w15 w16se w16cid w16 w16cex w16sdtdh wp14">
   <w:p>
     <w:pPr>
       <w:pStyle w:val="Footer"/>
@@ -463,7 +401,7 @@
 </file>
 
 <file path=word/footer3.xml><?xml version="1.0" encoding="utf-8"?>
-<w:ftr xmlns:m="http://schemas.openxmlformats.org/officeDocument/2006/math" xmlns:mc="http://schemas.openxmlformats.org/markup-compatibility/2006" xmlns:mo="http://schemas.microsoft.com/office/mac/office/2008/main" xmlns:mv="urn:schemas-microsoft-com:mac:vml" xmlns:o="urn:schemas-microsoft-com:office:office" xmlns:r="http://schemas.openxmlformats.org/officeDocument/2006/relationships" xmlns:v="urn:schemas-microsoft-com:vml" xmlns:w10="urn:schemas-microsoft-com:office:word" xmlns:w14="http://schemas.microsoft.com/office/word/2010/wordml" xmlns:w="http://schemas.openxmlformats.org/wordprocessingml/2006/main" xmlns:wne="http://schemas.microsoft.com/office/word/2006/wordml" xmlns:wp14="http://schemas.microsoft.com/office/word/2010/wordprocessingDrawing" xmlns:wp="http://schemas.openxmlformats.org/drawingml/2006/wordprocessingDrawing" xmlns:wpc="http://schemas.microsoft.com/office/word/2010/wordprocessingCanvas" xmlns:wpg="http://schemas.microsoft.com/office/word/2010/wordprocessingGroup" xmlns:wpi="http://schemas.microsoft.com/office/word/2010/wordprocessingInk" xmlns:wps="http://schemas.microsoft.com/office/word/2010/wordprocessingShape" mc:Ignorable="w14 wp14">
+<w:ftr xmlns:wpc="http://schemas.microsoft.com/office/word/2010/wordprocessingCanvas" xmlns:cx="http://schemas.microsoft.com/office/drawing/2014/chartex" xmlns:cx1="http://schemas.microsoft.com/office/drawing/2015/9/8/chartex" xmlns:cx2="http://schemas.microsoft.com/office/drawing/2015/10/21/chartex" xmlns:cx3="http://schemas.microsoft.com/office/drawing/2016/5/9/chartex" xmlns:cx4="http://schemas.microsoft.com/office/drawing/2016/5/10/chartex" xmlns:cx5="http://schemas.microsoft.com/office/drawing/2016/5/11/chartex" xmlns:cx6="http://schemas.microsoft.com/office/drawing/2016/5/12/chartex" xmlns:cx7="http://schemas.microsoft.com/office/drawing/2016/5/13/chartex" xmlns:cx8="http://schemas.microsoft.com/office/drawing/2016/5/14/chartex" xmlns:mc="http://schemas.openxmlformats.org/markup-compatibility/2006" xmlns:aink="http://schemas.microsoft.com/office/drawing/2016/ink" xmlns:am3d="http://schemas.microsoft.com/office/drawing/2017/model3d" xmlns:o="urn:schemas-microsoft-com:office:office" xmlns:r="http://schemas.openxmlformats.org/officeDocument/2006/relationships" xmlns:m="http://schemas.openxmlformats.org/officeDocument/2006/math" xmlns:v="urn:schemas-microsoft-com:vml" xmlns:wp14="http://schemas.microsoft.com/office/word/2010/wordprocessingDrawing" xmlns:wp="http://schemas.openxmlformats.org/drawingml/2006/wordprocessingDrawing" xmlns:w10="urn:schemas-microsoft-com:office:word" xmlns:w="http://schemas.openxmlformats.org/wordprocessingml/2006/main" xmlns:w14="http://schemas.microsoft.com/office/word/2010/wordml" xmlns:w15="http://schemas.microsoft.com/office/word/2012/wordml" xmlns:w16cex="http://schemas.microsoft.com/office/word/2018/wordml/cex" xmlns:w16cid="http://schemas.microsoft.com/office/word/2016/wordml/cid" xmlns:w16="http://schemas.microsoft.com/office/word/2018/wordml" xmlns:w16sdtdh="http://schemas.microsoft.com/office/word/2020/wordml/sdtdatahash" xmlns:w16se="http://schemas.microsoft.com/office/word/2015/wordml/symex" xmlns:wpg="http://schemas.microsoft.com/office/word/2010/wordprocessingGroup" xmlns:wpi="http://schemas.microsoft.com/office/word/2010/wordprocessingInk" xmlns:wne="http://schemas.microsoft.com/office/word/2006/wordml" xmlns:wps="http://schemas.microsoft.com/office/word/2010/wordprocessingShape" mc:Ignorable="w14 w15 w16se w16cid w16 w16cex w16sdtdh wp14">
   <w:p>
     <w:pPr>
       <w:pStyle w:val="Footer"/>
@@ -472,8 +410,33 @@
 </w:ftr>
 </file>
 
+<file path=word/footnotes.xml><?xml version="1.0" encoding="utf-8"?>
+<w:footnotes xmlns:wpc="http://schemas.microsoft.com/office/word/2010/wordprocessingCanvas" xmlns:cx="http://schemas.microsoft.com/office/drawing/2014/chartex" xmlns:cx1="http://schemas.microsoft.com/office/drawing/2015/9/8/chartex" xmlns:cx2="http://schemas.microsoft.com/office/drawing/2015/10/21/chartex" xmlns:cx3="http://schemas.microsoft.com/office/drawing/2016/5/9/chartex" xmlns:cx4="http://schemas.microsoft.com/office/drawing/2016/5/10/chartex" xmlns:cx5="http://schemas.microsoft.com/office/drawing/2016/5/11/chartex" xmlns:cx6="http://schemas.microsoft.com/office/drawing/2016/5/12/chartex" xmlns:cx7="http://schemas.microsoft.com/office/drawing/2016/5/13/chartex" xmlns:cx8="http://schemas.microsoft.com/office/drawing/2016/5/14/chartex" xmlns:mc="http://schemas.openxmlformats.org/markup-compatibility/2006" xmlns:aink="http://schemas.microsoft.com/office/drawing/2016/ink" xmlns:am3d="http://schemas.microsoft.com/office/drawing/2017/model3d" xmlns:o="urn:schemas-microsoft-com:office:office" xmlns:r="http://schemas.openxmlformats.org/officeDocument/2006/relationships" xmlns:m="http://schemas.openxmlformats.org/officeDocument/2006/math" xmlns:v="urn:schemas-microsoft-com:vml" xmlns:wp14="http://schemas.microsoft.com/office/word/2010/wordprocessingDrawing" xmlns:wp="http://schemas.openxmlformats.org/drawingml/2006/wordprocessingDrawing" xmlns:w10="urn:schemas-microsoft-com:office:word" xmlns:w="http://schemas.openxmlformats.org/wordprocessingml/2006/main" xmlns:w14="http://schemas.microsoft.com/office/word/2010/wordml" xmlns:w15="http://schemas.microsoft.com/office/word/2012/wordml" xmlns:w16cex="http://schemas.microsoft.com/office/word/2018/wordml/cex" xmlns:w16cid="http://schemas.microsoft.com/office/word/2016/wordml/cid" xmlns:w16="http://schemas.microsoft.com/office/word/2018/wordml" xmlns:w16sdtdh="http://schemas.microsoft.com/office/word/2020/wordml/sdtdatahash" xmlns:w16se="http://schemas.microsoft.com/office/word/2015/wordml/symex" xmlns:wpg="http://schemas.microsoft.com/office/word/2010/wordprocessingGroup" xmlns:wpi="http://schemas.microsoft.com/office/word/2010/wordprocessingInk" xmlns:wne="http://schemas.microsoft.com/office/word/2006/wordml" xmlns:wps="http://schemas.microsoft.com/office/word/2010/wordprocessingShape" mc:Ignorable="w14 w15 w16se w16cid w16 w16cex w16sdtdh wp14">
+  <w:footnote w:type="separator" w:id="-1">
+    <w:p>
+      <w:pPr>
+        <w:spacing w:before="0" w:after="0"/>
+      </w:pPr>
+      <w:r>
+        <w:separator/>
+      </w:r>
+    </w:p>
+  </w:footnote>
+  <w:footnote w:type="continuationSeparator" w:id="0">
+    <w:p>
+      <w:pPr>
+        <w:spacing w:before="0" w:after="0"/>
+      </w:pPr>
+      <w:r>
+        <w:continuationSeparator/>
+      </w:r>
+    </w:p>
+  </w:footnote>
+</w:footnotes>
+</file>
+
 <file path=word/header1.xml><?xml version="1.0" encoding="utf-8"?>
-<w:hdr xmlns:m="http://schemas.openxmlformats.org/officeDocument/2006/math" xmlns:mc="http://schemas.openxmlformats.org/markup-compatibility/2006" xmlns:mo="http://schemas.microsoft.com/office/mac/office/2008/main" xmlns:mv="urn:schemas-microsoft-com:mac:vml" xmlns:o="urn:schemas-microsoft-com:office:office" xmlns:r="http://schemas.openxmlformats.org/officeDocument/2006/relationships" xmlns:v="urn:schemas-microsoft-com:vml" xmlns:w10="urn:schemas-microsoft-com:office:word" xmlns:w14="http://schemas.microsoft.com/office/word/2010/wordml" xmlns:w="http://schemas.openxmlformats.org/wordprocessingml/2006/main" xmlns:wne="http://schemas.microsoft.com/office/word/2006/wordml" xmlns:wp14="http://schemas.microsoft.com/office/word/2010/wordprocessingDrawing" xmlns:wp="http://schemas.openxmlformats.org/drawingml/2006/wordprocessingDrawing" xmlns:wpc="http://schemas.microsoft.com/office/word/2010/wordprocessingCanvas" xmlns:wpg="http://schemas.microsoft.com/office/word/2010/wordprocessingGroup" xmlns:wpi="http://schemas.microsoft.com/office/word/2010/wordprocessingInk" xmlns:wps="http://schemas.microsoft.com/office/word/2010/wordprocessingShape" mc:Ignorable="w14 wp14">
+<w:hdr xmlns:wpc="http://schemas.microsoft.com/office/word/2010/wordprocessingCanvas" xmlns:cx="http://schemas.microsoft.com/office/drawing/2014/chartex" xmlns:cx1="http://schemas.microsoft.com/office/drawing/2015/9/8/chartex" xmlns:cx2="http://schemas.microsoft.com/office/drawing/2015/10/21/chartex" xmlns:cx3="http://schemas.microsoft.com/office/drawing/2016/5/9/chartex" xmlns:cx4="http://schemas.microsoft.com/office/drawing/2016/5/10/chartex" xmlns:cx5="http://schemas.microsoft.com/office/drawing/2016/5/11/chartex" xmlns:cx6="http://schemas.microsoft.com/office/drawing/2016/5/12/chartex" xmlns:cx7="http://schemas.microsoft.com/office/drawing/2016/5/13/chartex" xmlns:cx8="http://schemas.microsoft.com/office/drawing/2016/5/14/chartex" xmlns:mc="http://schemas.openxmlformats.org/markup-compatibility/2006" xmlns:aink="http://schemas.microsoft.com/office/drawing/2016/ink" xmlns:am3d="http://schemas.microsoft.com/office/drawing/2017/model3d" xmlns:o="urn:schemas-microsoft-com:office:office" xmlns:r="http://schemas.openxmlformats.org/officeDocument/2006/relationships" xmlns:m="http://schemas.openxmlformats.org/officeDocument/2006/math" xmlns:v="urn:schemas-microsoft-com:vml" xmlns:wp14="http://schemas.microsoft.com/office/word/2010/wordprocessingDrawing" xmlns:wp="http://schemas.openxmlformats.org/drawingml/2006/wordprocessingDrawing" xmlns:w10="urn:schemas-microsoft-com:office:word" xmlns:w="http://schemas.openxmlformats.org/wordprocessingml/2006/main" xmlns:w14="http://schemas.microsoft.com/office/word/2010/wordml" xmlns:w15="http://schemas.microsoft.com/office/word/2012/wordml" xmlns:w16cex="http://schemas.microsoft.com/office/word/2018/wordml/cex" xmlns:w16cid="http://schemas.microsoft.com/office/word/2016/wordml/cid" xmlns:w16="http://schemas.microsoft.com/office/word/2018/wordml" xmlns:w16sdtdh="http://schemas.microsoft.com/office/word/2020/wordml/sdtdatahash" xmlns:w16se="http://schemas.microsoft.com/office/word/2015/wordml/symex" xmlns:wpg="http://schemas.microsoft.com/office/word/2010/wordprocessingGroup" xmlns:wpi="http://schemas.microsoft.com/office/word/2010/wordprocessingInk" xmlns:wne="http://schemas.microsoft.com/office/word/2006/wordml" xmlns:wps="http://schemas.microsoft.com/office/word/2010/wordprocessingShape" mc:Ignorable="w14 w15 w16se w16cid w16 w16cex w16sdtdh wp14">
   <w:p>
     <w:pPr>
       <w:pStyle w:val="Header"/>
@@ -483,7 +446,7 @@
 </file>
 
 <file path=word/header2.xml><?xml version="1.0" encoding="utf-8"?>
-<w:hdr xmlns:m="http://schemas.openxmlformats.org/officeDocument/2006/math" xmlns:mc="http://schemas.openxmlformats.org/markup-compatibility/2006" xmlns:mo="http://schemas.microsoft.com/office/mac/office/2008/main" xmlns:mv="urn:schemas-microsoft-com:mac:vml" xmlns:o="urn:schemas-microsoft-com:office:office" xmlns:r="http://schemas.openxmlformats.org/officeDocument/2006/relationships" xmlns:v="urn:schemas-microsoft-com:vml" xmlns:w10="urn:schemas-microsoft-com:office:word" xmlns:w14="http://schemas.microsoft.com/office/word/2010/wordml" xmlns:w="http://schemas.openxmlformats.org/wordprocessingml/2006/main" xmlns:wne="http://schemas.microsoft.com/office/word/2006/wordml" xmlns:wp14="http://schemas.microsoft.com/office/word/2010/wordprocessingDrawing" xmlns:wp="http://schemas.openxmlformats.org/drawingml/2006/wordprocessingDrawing" xmlns:wpc="http://schemas.microsoft.com/office/word/2010/wordprocessingCanvas" xmlns:wpg="http://schemas.microsoft.com/office/word/2010/wordprocessingGroup" xmlns:wpi="http://schemas.microsoft.com/office/word/2010/wordprocessingInk" xmlns:wps="http://schemas.microsoft.com/office/word/2010/wordprocessingShape" mc:Ignorable="w14 wp14">
+<w:hdr xmlns:wpc="http://schemas.microsoft.com/office/word/2010/wordprocessingCanvas" xmlns:cx="http://schemas.microsoft.com/office/drawing/2014/chartex" xmlns:cx1="http://schemas.microsoft.com/office/drawing/2015/9/8/chartex" xmlns:cx2="http://schemas.microsoft.com/office/drawing/2015/10/21/chartex" xmlns:cx3="http://schemas.microsoft.com/office/drawing/2016/5/9/chartex" xmlns:cx4="http://schemas.microsoft.com/office/drawing/2016/5/10/chartex" xmlns:cx5="http://schemas.microsoft.com/office/drawing/2016/5/11/chartex" xmlns:cx6="http://schemas.microsoft.com/office/drawing/2016/5/12/chartex" xmlns:cx7="http://schemas.microsoft.com/office/drawing/2016/5/13/chartex" xmlns:cx8="http://schemas.microsoft.com/office/drawing/2016/5/14/chartex" xmlns:mc="http://schemas.openxmlformats.org/markup-compatibility/2006" xmlns:aink="http://schemas.microsoft.com/office/drawing/2016/ink" xmlns:am3d="http://schemas.microsoft.com/office/drawing/2017/model3d" xmlns:o="urn:schemas-microsoft-com:office:office" xmlns:r="http://schemas.openxmlformats.org/officeDocument/2006/relationships" xmlns:m="http://schemas.openxmlformats.org/officeDocument/2006/math" xmlns:v="urn:schemas-microsoft-com:vml" xmlns:wp14="http://schemas.microsoft.com/office/word/2010/wordprocessingDrawing" xmlns:wp="http://schemas.openxmlformats.org/drawingml/2006/wordprocessingDrawing" xmlns:w10="urn:schemas-microsoft-com:office:word" xmlns:w="http://schemas.openxmlformats.org/wordprocessingml/2006/main" xmlns:w14="http://schemas.microsoft.com/office/word/2010/wordml" xmlns:w15="http://schemas.microsoft.com/office/word/2012/wordml" xmlns:w16cex="http://schemas.microsoft.com/office/word/2018/wordml/cex" xmlns:w16cid="http://schemas.microsoft.com/office/word/2016/wordml/cid" xmlns:w16="http://schemas.microsoft.com/office/word/2018/wordml" xmlns:w16sdtdh="http://schemas.microsoft.com/office/word/2020/wordml/sdtdatahash" xmlns:w16se="http://schemas.microsoft.com/office/word/2015/wordml/symex" xmlns:wpg="http://schemas.microsoft.com/office/word/2010/wordprocessingGroup" xmlns:wpi="http://schemas.microsoft.com/office/word/2010/wordprocessingInk" xmlns:wne="http://schemas.microsoft.com/office/word/2006/wordml" xmlns:wps="http://schemas.microsoft.com/office/word/2010/wordprocessingShape" mc:Ignorable="w14 w15 w16se w16cid w16 w16cex w16sdtdh wp14">
   <w:p>
     <w:pPr>
       <w:pStyle w:val="Header"/>
@@ -493,7 +456,7 @@
 </file>
 
 <file path=word/header3.xml><?xml version="1.0" encoding="utf-8"?>
-<w:hdr xmlns:m="http://schemas.openxmlformats.org/officeDocument/2006/math" xmlns:mc="http://schemas.openxmlformats.org/markup-compatibility/2006" xmlns:mo="http://schemas.microsoft.com/office/mac/office/2008/main" xmlns:mv="urn:schemas-microsoft-com:mac:vml" xmlns:o="urn:schemas-microsoft-com:office:office" xmlns:r="http://schemas.openxmlformats.org/officeDocument/2006/relationships" xmlns:v="urn:schemas-microsoft-com:vml" xmlns:w10="urn:schemas-microsoft-com:office:word" xmlns:w14="http://schemas.microsoft.com/office/word/2010/wordml" xmlns:w="http://schemas.openxmlformats.org/wordprocessingml/2006/main" xmlns:wne="http://schemas.microsoft.com/office/word/2006/wordml" xmlns:wp14="http://schemas.microsoft.com/office/word/2010/wordprocessingDrawing" xmlns:wp="http://schemas.openxmlformats.org/drawingml/2006/wordprocessingDrawing" xmlns:wpc="http://schemas.microsoft.com/office/word/2010/wordprocessingCanvas" xmlns:wpg="http://schemas.microsoft.com/office/word/2010/wordprocessingGroup" xmlns:wpi="http://schemas.microsoft.com/office/word/2010/wordprocessingInk" xmlns:wps="http://schemas.microsoft.com/office/word/2010/wordprocessingShape" mc:Ignorable="w14 wp14">
+<w:hdr xmlns:wpc="http://schemas.microsoft.com/office/word/2010/wordprocessingCanvas" xmlns:cx="http://schemas.microsoft.com/office/drawing/2014/chartex" xmlns:cx1="http://schemas.microsoft.com/office/drawing/2015/9/8/chartex" xmlns:cx2="http://schemas.microsoft.com/office/drawing/2015/10/21/chartex" xmlns:cx3="http://schemas.microsoft.com/office/drawing/2016/5/9/chartex" xmlns:cx4="http://schemas.microsoft.com/office/drawing/2016/5/10/chartex" xmlns:cx5="http://schemas.microsoft.com/office/drawing/2016/5/11/chartex" xmlns:cx6="http://schemas.microsoft.com/office/drawing/2016/5/12/chartex" xmlns:cx7="http://schemas.microsoft.com/office/drawing/2016/5/13/chartex" xmlns:cx8="http://schemas.microsoft.com/office/drawing/2016/5/14/chartex" xmlns:mc="http://schemas.openxmlformats.org/markup-compatibility/2006" xmlns:aink="http://schemas.microsoft.com/office/drawing/2016/ink" xmlns:am3d="http://schemas.microsoft.com/office/drawing/2017/model3d" xmlns:o="urn:schemas-microsoft-com:office:office" xmlns:r="http://schemas.openxmlformats.org/officeDocument/2006/relationships" xmlns:m="http://schemas.openxmlformats.org/officeDocument/2006/math" xmlns:v="urn:schemas-microsoft-com:vml" xmlns:wp14="http://schemas.microsoft.com/office/word/2010/wordprocessingDrawing" xmlns:wp="http://schemas.openxmlformats.org/drawingml/2006/wordprocessingDrawing" xmlns:w10="urn:schemas-microsoft-com:office:word" xmlns:w="http://schemas.openxmlformats.org/wordprocessingml/2006/main" xmlns:w14="http://schemas.microsoft.com/office/word/2010/wordml" xmlns:w15="http://schemas.microsoft.com/office/word/2012/wordml" xmlns:w16cex="http://schemas.microsoft.com/office/word/2018/wordml/cex" xmlns:w16cid="http://schemas.microsoft.com/office/word/2016/wordml/cid" xmlns:w16="http://schemas.microsoft.com/office/word/2018/wordml" xmlns:w16sdtdh="http://schemas.microsoft.com/office/word/2020/wordml/sdtdatahash" xmlns:w16se="http://schemas.microsoft.com/office/word/2015/wordml/symex" xmlns:wpg="http://schemas.microsoft.com/office/word/2010/wordprocessingGroup" xmlns:wpi="http://schemas.microsoft.com/office/word/2010/wordprocessingInk" xmlns:wne="http://schemas.microsoft.com/office/word/2006/wordml" xmlns:wps="http://schemas.microsoft.com/office/word/2010/wordprocessingShape" mc:Ignorable="w14 w15 w16se w16cid w16 w16cex w16sdtdh wp14">
   <w:p>
     <w:pPr>
       <w:pStyle w:val="Header"/>

</xml_diff>